<commit_message>
rebuild project section and detail page
</commit_message>
<xml_diff>
--- a/documents/resume/Htet-Ko-Oo-Resume.docx
+++ b/documents/resume/Htet-Ko-Oo-Resume.docx
@@ -413,7 +413,7 @@
           <w:color w:val="142735"/>
           <w:sz w:val="17"/>
         </w:rPr>
-        <w:t>Built a privacy-focused two-person web app with couple-scoped authorization, validated private-memory workflows, and versioned database migrations.</w:t>
+        <w:t>Built a privacy-focused couple app with invitation-based partner access, couple-scoped authorization, private memories and media, and responsive mobile-first UI.</w:t>
       </w:r>
     </w:p>
     <w:p>
@@ -429,7 +429,7 @@
           <w:color w:val="142735"/>
           <w:sz w:val="17"/>
         </w:rPr>
-        <w:t>Designed input validation and private media handling foundations for shared settings and personal content.</w:t>
+        <w:t>Implemented mutual-answer reveals, Little Jar notes, love letters, presence status, and scheduled Resend email reminders.</w:t>
       </w:r>
     </w:p>
     <w:p>

</xml_diff>